<commit_message>
Table 1: isotropic marker moved to the caption so the column does not wrap
Co-Authored-By: Claude Fable 5.1 <noreply@anthropic.com>
Claude-Session: https://claude.ai/code/session_01A1WQ3WGcJw8tT3QK2n57xo
</commit_message>
<xml_diff>
--- a/manuscript/unityEQE_v21_ko.docx
+++ b/manuscript/unityEQE_v21_ko.docx
@@ -696,7 +696,7 @@
         <w:rPr>
           <w:b w:val="0"/>
         </w:rPr>
-        <w:t xml:space="preserve"> 스택: Ag 100 nm / B3PyMPM d_ETL / TCTA:B3PyMPM 25 nm (발광 위치 중앙) / TAPC 180 nm / ITO 50 nm / 기판 n = 1.8 + 반구형 microlens array (n_MLA = 1.8, 행렬 급수). 광학상수는 실측값(B3PyMPM n_o/n_e = 1.821/1.609, TCTA:B3PyMPM 1.833/1.671, TAPC 1.691/1.664)이며, ITO는 König 등[21]의 n = 1.864에 k를 0.0032(문헌값) 또는 0.002로 두었다. SPP 손실은 evanescent 성분 전체(SPP 모드 포함)이다. 식 (3)으로 계산하면 η_ext 0.932–0.945, EQE 0.888–0.924로 급수보다 1.4–2.5%p 높다(식 (3)은 상한).</w:t>
+        <w:t xml:space="preserve"> 스택: Ag 100 nm / B3PyMPM d_ETL / TCTA:B3PyMPM 25 nm (발광 위치 중앙) / TAPC 180 nm / ITO 50 nm / 기판 n = 1.8 + 반구형 microlens array (n_MLA = 1.8, 행렬 급수). 광학상수는 실측값(B3PyMPM n_o/n_e = 1.821/1.609, TCTA:B3PyMPM 1.833/1.671, TAPC 1.691/1.664)이며, ITO는 König 등[21]의 n = 1.864에 k를 0.0032(문헌값) 또는 0.002로 두었다. Θ = 0.67은 등방성 발광체이다. SPP 손실은 evanescent 성분 전체(SPP 모드 포함)이다. 식 (3)으로 계산하면 η_ext 0.932–0.945, EQE 0.888–0.924로 급수보다 1.4–2.5%p 높다(식 (3)은 상한).</w:t>
       </w:r>
     </w:p>
     <w:p/>
@@ -879,7 +879,7 @@
                 <w:b w:val="0"/>
                 <w:sz w:val="16"/>
               </w:rPr>
-              <w:t>0.67 (등방성)</w:t>
+              <w:t>0.67</w:t>
             </w:r>
           </w:p>
         </w:tc>
@@ -1245,7 +1245,7 @@
                 <w:b w:val="0"/>
                 <w:sz w:val="16"/>
               </w:rPr>
-              <w:t>0.67 (등방성)</w:t>
+              <w:t>0.67</w:t>
             </w:r>
           </w:p>
         </w:tc>
@@ -1611,7 +1611,7 @@
                 <w:b w:val="0"/>
                 <w:sz w:val="16"/>
               </w:rPr>
-              <w:t>0.67 (등방성)</w:t>
+              <w:t>0.67</w:t>
             </w:r>
           </w:p>
         </w:tc>
@@ -1977,7 +1977,7 @@
                 <w:b w:val="0"/>
                 <w:sz w:val="16"/>
               </w:rPr>
-              <w:t>0.67 (등방성)</w:t>
+              <w:t>0.67</w:t>
             </w:r>
           </w:p>
         </w:tc>

</xml_diff>